<commit_message>
Thoroughl tested canvas scaling and made notes on findings
</commit_message>
<xml_diff>
--- a/UI Inventory.docx
+++ b/UI Inventory.docx
@@ -88,6 +88,31 @@
       </w:r>
       <w:r>
         <w:t>, easy to interact</w:t>
+      </w:r>
+    </w:p>
+    <w:p/>
+    <w:p>
+      <w:r>
+        <w:t>Problems:</w:t>
+      </w:r>
+    </w:p>
+    <w:p>
+      <w:r>
+        <w:t>When testing in simulator, player doesn’t have a mouse to rotate to and face, therefore the player is facing starting position affecting shooting. Should be an easy fix.</w:t>
+      </w:r>
+    </w:p>
+    <w:p/>
+    <w:p>
+      <w:r>
+        <w:t>Notes:</w:t>
+      </w:r>
+    </w:p>
+    <w:p>
+      <w:r>
+        <w:t>Moving match to 1 significantly makes the UI elements smaller and moves them a lot. The joystick is moved into an awkward position on the bottom left edge of the screen on multiple device layouts.</w:t>
+      </w:r>
+      <w:r>
+        <w:t xml:space="preserve"> Due to this and other tests, I have decided to drop match down to 0 along with scale with screen size and 800 x 600 reference resolution. I have also kept the screen match mode as match width or height.</w:t>
       </w:r>
     </w:p>
     <w:p/>

</xml_diff>

<commit_message>
I have completed what I could from task 3 without building on a phone.
More notes made
</commit_message>
<xml_diff>
--- a/UI Inventory.docx
+++ b/UI Inventory.docx
@@ -113,6 +113,11 @@
       </w:r>
       <w:r>
         <w:t xml:space="preserve"> Due to this and other tests, I have decided to drop match down to 0 along with scale with screen size and 800 x 600 reference resolution. I have also kept the screen match mode as match width or height.</w:t>
+      </w:r>
+    </w:p>
+    <w:p>
+      <w:r>
+        <w:t>When I eventually get access to an android phone, I will test again to ensure the UI proportions and controls comfortability remains adequate. If it doesn’t, I will look into adding a separate root canvas with constant physical size.</w:t>
       </w:r>
     </w:p>
     <w:p/>

</xml_diff>